<commit_message>
report sections 1-5 complete and excel output complete
</commit_message>
<xml_diff>
--- a/demo/inquiries-output/Q1-2026/تقرير تحليل استفسارات المتعاملين — الربع الأول 2026.docx
+++ b/demo/inquiries-output/Q1-2026/تقرير تحليل استفسارات المتعاملين — الربع الأول 2026.docx
@@ -6900,6 +6900,7 @@
           <w:rtl/>
         </w:rPr>
       </w:pPr>
+      <w:proofErr w:type="gramStart"/>
       <w:r>
         <w:rPr>
           <w:rFonts w:ascii="Dubai" w:eastAsia="Arial" w:hAnsi="Dubai"/>
@@ -6917,7 +6918,18 @@
           <w:color w:val="B68A35"/>
           <w:rtl/>
         </w:rPr>
-        <w:t xml:space="preserve">  تفصيل الطلبات والاستفسارات</w:t>
+        <w:t xml:space="preserve">  تفصيل</w:t>
+      </w:r>
+      <w:proofErr w:type="gramEnd"/>
+      <w:r>
+        <w:rPr>
+          <w:rFonts w:ascii="Dubai" w:eastAsia="Arial" w:hAnsi="Dubai"/>
+          <w:b/>
+          <w:bCs/>
+          <w:color w:val="B68A35"/>
+          <w:rtl/>
+        </w:rPr>
+        <w:t xml:space="preserve"> الطلبات والاستفسارات</w:t>
       </w:r>
     </w:p>
     <w:p>
@@ -9437,6 +9449,7 @@
           <w:color w:val="1F3864"/>
           <w:sz w:val="20"/>
           <w:szCs w:val="20"/>
+          <w:highlight w:val="yellow"/>
           <w:rtl/>
         </w:rPr>
         <w:t xml:space="preserve">إجراء تحسيني ذو أثر كبير: </w:t>
@@ -9447,6 +9460,7 @@
           <w:color w:val="404040"/>
           <w:sz w:val="20"/>
           <w:szCs w:val="20"/>
+          <w:highlight w:val="yellow"/>
           <w:rtl/>
         </w:rPr>
         <w:t xml:space="preserve">مجموع حالات عدم استلام وثيقة الرخصة بعد التجديد الإلكتروني يبلغ 17+ حالة في </w:t>
@@ -9457,6 +9471,7 @@
           <w:color w:val="404040"/>
           <w:sz w:val="20"/>
           <w:szCs w:val="20"/>
+          <w:highlight w:val="yellow"/>
         </w:rPr>
         <w:t>Q1 2026</w:t>
       </w:r>
@@ -9466,6 +9481,7 @@
           <w:color w:val="404040"/>
           <w:sz w:val="20"/>
           <w:szCs w:val="20"/>
+          <w:highlight w:val="yellow"/>
           <w:rtl/>
         </w:rPr>
         <w:t xml:space="preserve"> وحده يمكن إلغاؤها كلياً بتفعيل رسالة </w:t>
@@ -9476,6 +9492,7 @@
           <w:color w:val="404040"/>
           <w:sz w:val="20"/>
           <w:szCs w:val="20"/>
+          <w:highlight w:val="yellow"/>
         </w:rPr>
         <w:t>SMS</w:t>
       </w:r>
@@ -9485,6 +9502,7 @@
           <w:color w:val="404040"/>
           <w:sz w:val="20"/>
           <w:szCs w:val="20"/>
+          <w:highlight w:val="yellow"/>
           <w:rtl/>
         </w:rPr>
         <w:t xml:space="preserve"> تلقائية تحمل رقم تتبع بريد الإمارات فور إرسال الرخصة — دون الحاجة إلى أي تغيير في المنصة أو هيكل الخدمة. هذا الإجراء الوحيد يحل 11.5% من إجمالي شكاوى </w:t>
@@ -9495,6 +9513,7 @@
           <w:color w:val="404040"/>
           <w:sz w:val="20"/>
           <w:szCs w:val="20"/>
+          <w:highlight w:val="yellow"/>
         </w:rPr>
         <w:t>Q1 2026</w:t>
       </w:r>
@@ -9504,6 +9523,7 @@
           <w:color w:val="404040"/>
           <w:sz w:val="20"/>
           <w:szCs w:val="20"/>
+          <w:highlight w:val="yellow"/>
           <w:rtl/>
         </w:rPr>
         <w:t>.</w:t>
@@ -19320,69 +19340,8 @@
         <w:sz w:val="20"/>
         <w:szCs w:val="20"/>
       </w:rPr>
-      <w:t xml:space="preserve"> </w:t>
+      <w:t xml:space="preserve"> تحليل استفسارات المتعاملين</w:t>
     </w:r>
-    <w:proofErr w:type="spellStart"/>
-    <w:r>
-      <w:rPr>
-        <w:rFonts w:ascii="Dubai" w:hAnsi="Dubai"/>
-        <w:b/>
-        <w:bCs/>
-        <w:color w:val="B68A35"/>
-        <w:sz w:val="20"/>
-        <w:szCs w:val="20"/>
-      </w:rPr>
-      <w:t>تحليل</w:t>
-    </w:r>
-    <w:proofErr w:type="spellEnd"/>
-    <w:r>
-      <w:rPr>
-        <w:rFonts w:ascii="Dubai" w:hAnsi="Dubai"/>
-        <w:b/>
-        <w:bCs/>
-        <w:color w:val="B68A35"/>
-        <w:sz w:val="20"/>
-        <w:szCs w:val="20"/>
-      </w:rPr>
-      <w:t xml:space="preserve"> </w:t>
-    </w:r>
-    <w:proofErr w:type="spellStart"/>
-    <w:r>
-      <w:rPr>
-        <w:rFonts w:ascii="Dubai" w:hAnsi="Dubai"/>
-        <w:b/>
-        <w:bCs/>
-        <w:color w:val="B68A35"/>
-        <w:sz w:val="20"/>
-        <w:szCs w:val="20"/>
-      </w:rPr>
-      <w:t>استفسارات</w:t>
-    </w:r>
-    <w:proofErr w:type="spellEnd"/>
-    <w:r>
-      <w:rPr>
-        <w:rFonts w:ascii="Dubai" w:hAnsi="Dubai"/>
-        <w:b/>
-        <w:bCs/>
-        <w:color w:val="B68A35"/>
-        <w:sz w:val="20"/>
-        <w:szCs w:val="20"/>
-      </w:rPr>
-      <w:t xml:space="preserve"> </w:t>
-    </w:r>
-    <w:proofErr w:type="spellStart"/>
-    <w:r>
-      <w:rPr>
-        <w:rFonts w:ascii="Dubai" w:hAnsi="Dubai"/>
-        <w:b/>
-        <w:bCs/>
-        <w:color w:val="B68A35"/>
-        <w:sz w:val="20"/>
-        <w:szCs w:val="20"/>
-      </w:rPr>
-      <w:t>المتعاملين</w:t>
-    </w:r>
-    <w:proofErr w:type="spellEnd"/>
     <w:r>
       <w:rPr>
         <w:rFonts w:ascii="Dubai" w:hAnsi="Dubai" w:hint="cs"/>

</xml_diff>